<commit_message>
Fix: Memperbaiki typo ID tombol dan mengaktifkan render kartu dinamis dengan Array
</commit_message>
<xml_diff>
--- a/Belajar web.docx
+++ b/Belajar web.docx
@@ -3291,6 +3291,7 @@
         <w:keepLines w:val="0"/>
         <w:widowControl/>
         <w:numPr>
+          <w:ilvl w:val="0"/>
           <w:numId w:val="0"/>
         </w:numPr>
         <w:suppressLineNumbers w:val="0"/>
@@ -3398,7 +3399,7 @@
       </w:r>
       <w:r>
         <w:rPr>
-          <w:rFonts w:hint="default" w:cs="Times New Roman"/>
+          <w:rFonts w:hint="default" w:ascii="Times New Roman" w:hAnsi="Times New Roman" w:cs="Times New Roman"/>
           <w:lang w:val="en-US"/>
         </w:rPr>
         <w:t>.</w:t>
@@ -3565,6 +3566,434 @@
           <w:rFonts w:hint="default" w:ascii="Times New Roman" w:hAnsi="Times New Roman" w:cs="Times New Roman"/>
         </w:rPr>
         <w:t xml:space="preserve"> agar aset gambar (seperti logo GitHub) tetap proporsional dan tidak merusak tata letak di layar HP.</w:t>
+      </w:r>
+    </w:p>
+    <w:p>
+      <w:pPr>
+        <w:pStyle w:val="4"/>
+        <w:keepNext w:val="0"/>
+        <w:keepLines w:val="0"/>
+        <w:widowControl/>
+        <w:suppressLineNumbers w:val="0"/>
+        <w:rPr>
+          <w:rFonts w:hint="default" w:ascii="Times New Roman" w:hAnsi="Times New Roman" w:cs="Times New Roman"/>
+        </w:rPr>
+      </w:pPr>
+    </w:p>
+    <w:p>
+      <w:pPr>
+        <w:pStyle w:val="4"/>
+        <w:keepNext w:val="0"/>
+        <w:keepLines w:val="0"/>
+        <w:widowControl/>
+        <w:suppressLineNumbers w:val="0"/>
+        <w:rPr>
+          <w:rFonts w:hint="default" w:ascii="Times New Roman" w:hAnsi="Times New Roman" w:cs="Times New Roman"/>
+        </w:rPr>
+      </w:pPr>
+    </w:p>
+    <w:p>
+      <w:pPr>
+        <w:pStyle w:val="4"/>
+        <w:keepNext w:val="0"/>
+        <w:keepLines w:val="0"/>
+        <w:widowControl/>
+        <w:suppressLineNumbers w:val="0"/>
+        <w:rPr>
+          <w:rFonts w:hint="default" w:ascii="Times New Roman" w:hAnsi="Times New Roman" w:cs="Times New Roman"/>
+        </w:rPr>
+      </w:pPr>
+    </w:p>
+    <w:p>
+      <w:pPr>
+        <w:pStyle w:val="4"/>
+        <w:keepNext w:val="0"/>
+        <w:keepLines w:val="0"/>
+        <w:widowControl/>
+        <w:suppressLineNumbers w:val="0"/>
+        <w:rPr>
+          <w:rFonts w:hint="default" w:ascii="Times New Roman" w:hAnsi="Times New Roman" w:cs="Times New Roman"/>
+        </w:rPr>
+      </w:pPr>
+    </w:p>
+    <w:p>
+      <w:pPr>
+        <w:pStyle w:val="4"/>
+        <w:keepNext w:val="0"/>
+        <w:keepLines w:val="0"/>
+        <w:widowControl/>
+        <w:suppressLineNumbers w:val="0"/>
+        <w:rPr>
+          <w:rFonts w:hint="default" w:ascii="Times New Roman" w:hAnsi="Times New Roman" w:cs="Times New Roman"/>
+        </w:rPr>
+      </w:pPr>
+      <w:r>
+        <w:rPr>
+          <w:rFonts w:hint="default" w:ascii="Times New Roman" w:hAnsi="Times New Roman" w:cs="Times New Roman"/>
+        </w:rPr>
+        <w:t>Rangkuman Pencapaian Hari Ini (8 Mei 2026)</w:t>
+      </w:r>
+    </w:p>
+    <w:p>
+      <w:pPr>
+        <w:pStyle w:val="10"/>
+        <w:keepNext w:val="0"/>
+        <w:keepLines w:val="0"/>
+        <w:widowControl/>
+        <w:suppressLineNumbers w:val="0"/>
+        <w:rPr>
+          <w:rFonts w:hint="default" w:ascii="Times New Roman" w:hAnsi="Times New Roman" w:cs="Times New Roman"/>
+        </w:rPr>
+      </w:pPr>
+      <w:r>
+        <w:rPr>
+          <w:rFonts w:hint="default" w:ascii="Times New Roman" w:hAnsi="Times New Roman" w:cs="Times New Roman"/>
+        </w:rPr>
+        <w:t>Sesi malam ini difokuskan pada transisi dari kode tingkat pemula (</w:t>
+      </w:r>
+      <w:r>
+        <w:rPr>
+          <w:rFonts w:hint="default" w:ascii="Times New Roman" w:hAnsi="Times New Roman" w:cs="Times New Roman"/>
+          <w:i/>
+          <w:iCs/>
+        </w:rPr>
+        <w:t>beginner</w:t>
+      </w:r>
+      <w:r>
+        <w:rPr>
+          <w:rFonts w:hint="default" w:ascii="Times New Roman" w:hAnsi="Times New Roman" w:cs="Times New Roman"/>
+        </w:rPr>
+        <w:t>) menuju standar penulisan kode profesional (</w:t>
+      </w:r>
+      <w:r>
+        <w:rPr>
+          <w:rFonts w:hint="default" w:ascii="Times New Roman" w:hAnsi="Times New Roman" w:cs="Times New Roman"/>
+          <w:i/>
+          <w:iCs/>
+        </w:rPr>
+        <w:t>industry standard</w:t>
+      </w:r>
+      <w:r>
+        <w:rPr>
+          <w:rFonts w:hint="default" w:ascii="Times New Roman" w:hAnsi="Times New Roman" w:cs="Times New Roman"/>
+        </w:rPr>
+        <w:t>):</w:t>
+      </w:r>
+    </w:p>
+    <w:p>
+      <w:pPr>
+        <w:pStyle w:val="10"/>
+        <w:keepNext w:val="0"/>
+        <w:keepLines w:val="0"/>
+        <w:widowControl/>
+        <w:suppressLineNumbers w:val="0"/>
+        <w:rPr>
+          <w:rFonts w:hint="default" w:ascii="Times New Roman" w:hAnsi="Times New Roman" w:cs="Times New Roman"/>
+        </w:rPr>
+      </w:pPr>
+      <w:r>
+        <w:rPr>
+          <w:rFonts w:hint="default" w:ascii="Times New Roman" w:hAnsi="Times New Roman" w:cs="Times New Roman"/>
+          <w:b/>
+          <w:bCs/>
+        </w:rPr>
+        <w:t>1. Tata Letak 2 Dimensi (CSS Grid)</w:t>
+      </w:r>
+    </w:p>
+    <w:p>
+      <w:pPr>
+        <w:pStyle w:val="10"/>
+        <w:keepNext w:val="0"/>
+        <w:keepLines w:val="0"/>
+        <w:widowControl/>
+        <w:suppressLineNumbers w:val="0"/>
+        <w:ind w:left="720"/>
+        <w:rPr>
+          <w:rFonts w:hint="default" w:ascii="Times New Roman" w:hAnsi="Times New Roman" w:cs="Times New Roman"/>
+        </w:rPr>
+      </w:pPr>
+      <w:r>
+        <w:rPr>
+          <w:rFonts w:hint="default" w:ascii="Times New Roman" w:hAnsi="Times New Roman" w:cs="Times New Roman"/>
+          <w:b/>
+          <w:bCs/>
+        </w:rPr>
+        <w:t>Konsep:</w:t>
+      </w:r>
+      <w:r>
+        <w:rPr>
+          <w:rFonts w:hint="default" w:ascii="Times New Roman" w:hAnsi="Times New Roman" w:cs="Times New Roman"/>
+        </w:rPr>
+        <w:t xml:space="preserve"> Jika Flexbox digunakan untuk merapikan elemen dalam satu garis (1 Dimensi), CSS Grid digunakan untuk membangun tata letak yang memiliki baris dan kolom secara bersamaan (2 Dimensi).</w:t>
+      </w:r>
+    </w:p>
+    <w:p>
+      <w:pPr>
+        <w:pStyle w:val="10"/>
+        <w:keepNext w:val="0"/>
+        <w:keepLines w:val="0"/>
+        <w:widowControl/>
+        <w:suppressLineNumbers w:val="0"/>
+        <w:ind w:left="720"/>
+        <w:rPr>
+          <w:rFonts w:hint="default" w:ascii="Times New Roman" w:hAnsi="Times New Roman" w:cs="Times New Roman"/>
+        </w:rPr>
+      </w:pPr>
+      <w:r>
+        <w:rPr>
+          <w:rFonts w:hint="default" w:ascii="Times New Roman" w:hAnsi="Times New Roman" w:cs="Times New Roman"/>
+          <w:b/>
+          <w:bCs/>
+        </w:rPr>
+        <w:t>Eksekusi:</w:t>
+      </w:r>
+      <w:r>
+        <w:rPr>
+          <w:rFonts w:hint="default" w:ascii="Times New Roman" w:hAnsi="Times New Roman" w:cs="Times New Roman"/>
+        </w:rPr>
+        <w:t xml:space="preserve"> Mengubah susunan Galeri Proyek menggunakan </w:t>
+      </w:r>
+      <w:r>
+        <w:rPr>
+          <w:rStyle w:val="8"/>
+          <w:rFonts w:hint="default" w:ascii="Times New Roman" w:hAnsi="Times New Roman" w:cs="Times New Roman"/>
+        </w:rPr>
+        <w:t>display: grid;</w:t>
+      </w:r>
+      <w:r>
+        <w:rPr>
+          <w:rFonts w:hint="default" w:ascii="Times New Roman" w:hAnsi="Times New Roman" w:cs="Times New Roman"/>
+        </w:rPr>
+        <w:t xml:space="preserve"> dan membaginya menjadi 3 kolom yang sama besar menggunakan fungsi </w:t>
+      </w:r>
+      <w:r>
+        <w:rPr>
+          <w:rStyle w:val="8"/>
+          <w:rFonts w:hint="default" w:ascii="Times New Roman" w:hAnsi="Times New Roman" w:cs="Times New Roman"/>
+        </w:rPr>
+        <w:t>grid-template-columns: repeat(3, 1fr);</w:t>
+      </w:r>
+    </w:p>
+    <w:p>
+      <w:pPr>
+        <w:pStyle w:val="10"/>
+        <w:keepNext w:val="0"/>
+        <w:keepLines w:val="0"/>
+        <w:widowControl/>
+        <w:suppressLineNumbers w:val="0"/>
+        <w:ind w:left="720"/>
+        <w:rPr>
+          <w:rFonts w:hint="default" w:ascii="Times New Roman" w:hAnsi="Times New Roman" w:cs="Times New Roman"/>
+        </w:rPr>
+      </w:pPr>
+      <w:r>
+        <w:rPr>
+          <w:rFonts w:hint="default" w:ascii="Times New Roman" w:hAnsi="Times New Roman" w:cs="Times New Roman"/>
+          <w:b/>
+          <w:bCs/>
+        </w:rPr>
+        <w:t>Responsivitas:</w:t>
+      </w:r>
+      <w:r>
+        <w:rPr>
+          <w:rFonts w:hint="default" w:ascii="Times New Roman" w:hAnsi="Times New Roman" w:cs="Times New Roman"/>
+        </w:rPr>
+        <w:t xml:space="preserve"> Menjinakkan Grid di layar HP menggunakan </w:t>
+      </w:r>
+      <w:r>
+        <w:rPr>
+          <w:rFonts w:hint="default" w:ascii="Times New Roman" w:hAnsi="Times New Roman" w:cs="Times New Roman"/>
+          <w:i/>
+          <w:iCs/>
+        </w:rPr>
+        <w:t>Media Queries</w:t>
+      </w:r>
+      <w:r>
+        <w:rPr>
+          <w:rFonts w:hint="default" w:ascii="Times New Roman" w:hAnsi="Times New Roman" w:cs="Times New Roman"/>
+        </w:rPr>
+        <w:t xml:space="preserve"> </w:t>
+      </w:r>
+      <w:r>
+        <w:rPr>
+          <w:rStyle w:val="8"/>
+          <w:rFonts w:hint="default" w:ascii="Times New Roman" w:hAnsi="Times New Roman" w:cs="Times New Roman"/>
+        </w:rPr>
+        <w:t>@media (max-width: 768px)</w:t>
+      </w:r>
+      <w:r>
+        <w:rPr>
+          <w:rFonts w:hint="default" w:ascii="Times New Roman" w:hAnsi="Times New Roman" w:cs="Times New Roman"/>
+        </w:rPr>
+        <w:t xml:space="preserve"> dengan mengubah strukturnya menjadi 1 kolom (</w:t>
+      </w:r>
+      <w:r>
+        <w:rPr>
+          <w:rStyle w:val="8"/>
+          <w:rFonts w:hint="default" w:ascii="Times New Roman" w:hAnsi="Times New Roman" w:cs="Times New Roman"/>
+        </w:rPr>
+        <w:t>1fr</w:t>
+      </w:r>
+      <w:r>
+        <w:rPr>
+          <w:rFonts w:hint="default" w:ascii="Times New Roman" w:hAnsi="Times New Roman" w:cs="Times New Roman"/>
+        </w:rPr>
+        <w:t>) agar kartu tidak tergencet.</w:t>
+      </w:r>
+    </w:p>
+    <w:p>
+      <w:pPr>
+        <w:pStyle w:val="10"/>
+        <w:keepNext w:val="0"/>
+        <w:keepLines w:val="0"/>
+        <w:widowControl/>
+        <w:suppressLineNumbers w:val="0"/>
+        <w:rPr>
+          <w:rFonts w:hint="default" w:ascii="Times New Roman" w:hAnsi="Times New Roman" w:cs="Times New Roman"/>
+        </w:rPr>
+      </w:pPr>
+      <w:r>
+        <w:rPr>
+          <w:rFonts w:hint="default" w:ascii="Times New Roman" w:hAnsi="Times New Roman" w:cs="Times New Roman"/>
+          <w:b/>
+          <w:bCs/>
+        </w:rPr>
+        <w:t>2. Separation of Concerns (Pemisahan Tanggung Jawab Kode)</w:t>
+      </w:r>
+    </w:p>
+    <w:p>
+      <w:pPr>
+        <w:pStyle w:val="10"/>
+        <w:keepNext w:val="0"/>
+        <w:keepLines w:val="0"/>
+        <w:widowControl/>
+        <w:suppressLineNumbers w:val="0"/>
+        <w:ind w:left="720"/>
+        <w:rPr>
+          <w:rFonts w:hint="default" w:ascii="Times New Roman" w:hAnsi="Times New Roman" w:cs="Times New Roman"/>
+        </w:rPr>
+      </w:pPr>
+      <w:r>
+        <w:rPr>
+          <w:rFonts w:hint="default" w:ascii="Times New Roman" w:hAnsi="Times New Roman" w:cs="Times New Roman"/>
+          <w:b/>
+          <w:bCs/>
+        </w:rPr>
+        <w:t>Konsep:</w:t>
+      </w:r>
+      <w:r>
+        <w:rPr>
+          <w:rFonts w:hint="default" w:ascii="Times New Roman" w:hAnsi="Times New Roman" w:cs="Times New Roman"/>
+        </w:rPr>
+        <w:t xml:space="preserve"> Praktik memisahkan struktur (HTML), gaya (CSS), dan logika (JavaScript) agar tidak saling bercampur aduk (</w:t>
+      </w:r>
+      <w:r>
+        <w:rPr>
+          <w:rFonts w:hint="default" w:ascii="Times New Roman" w:hAnsi="Times New Roman" w:cs="Times New Roman"/>
+          <w:i/>
+          <w:iCs/>
+        </w:rPr>
+        <w:t>Clean Code</w:t>
+      </w:r>
+      <w:r>
+        <w:rPr>
+          <w:rFonts w:hint="default" w:ascii="Times New Roman" w:hAnsi="Times New Roman" w:cs="Times New Roman"/>
+        </w:rPr>
+        <w:t>).</w:t>
+      </w:r>
+    </w:p>
+    <w:p>
+      <w:pPr>
+        <w:pStyle w:val="10"/>
+        <w:keepNext w:val="0"/>
+        <w:keepLines w:val="0"/>
+        <w:widowControl/>
+        <w:suppressLineNumbers w:val="0"/>
+        <w:ind w:left="720"/>
+        <w:rPr>
+          <w:rFonts w:hint="default" w:ascii="Times New Roman" w:hAnsi="Times New Roman" w:cs="Times New Roman"/>
+        </w:rPr>
+      </w:pPr>
+      <w:r>
+        <w:rPr>
+          <w:rFonts w:hint="default" w:ascii="Times New Roman" w:hAnsi="Times New Roman" w:cs="Times New Roman"/>
+          <w:b/>
+          <w:bCs/>
+        </w:rPr>
+        <w:t>Eksekusi:</w:t>
+      </w:r>
+      <w:r>
+        <w:rPr>
+          <w:rFonts w:hint="default" w:ascii="Times New Roman" w:hAnsi="Times New Roman" w:cs="Times New Roman"/>
+        </w:rPr>
+        <w:t xml:space="preserve"> Membersihkan seluruh atribut </w:t>
+      </w:r>
+      <w:r>
+        <w:rPr>
+          <w:rStyle w:val="8"/>
+          <w:rFonts w:hint="default" w:ascii="Times New Roman" w:hAnsi="Times New Roman" w:cs="Times New Roman"/>
+        </w:rPr>
+        <w:t>onclick</w:t>
+      </w:r>
+      <w:r>
+        <w:rPr>
+          <w:rFonts w:hint="default" w:ascii="Times New Roman" w:hAnsi="Times New Roman" w:cs="Times New Roman"/>
+        </w:rPr>
+        <w:t xml:space="preserve"> (</w:t>
+      </w:r>
+      <w:r>
+        <w:rPr>
+          <w:rFonts w:hint="default" w:ascii="Times New Roman" w:hAnsi="Times New Roman" w:cs="Times New Roman"/>
+          <w:i/>
+          <w:iCs/>
+        </w:rPr>
+        <w:t>Inline Handler</w:t>
+      </w:r>
+      <w:r>
+        <w:rPr>
+          <w:rFonts w:hint="default" w:ascii="Times New Roman" w:hAnsi="Times New Roman" w:cs="Times New Roman"/>
+        </w:rPr>
+        <w:t>) dari file HTML.</w:t>
+      </w:r>
+    </w:p>
+    <w:p>
+      <w:pPr>
+        <w:pStyle w:val="10"/>
+        <w:keepNext w:val="0"/>
+        <w:keepLines w:val="0"/>
+        <w:widowControl/>
+        <w:suppressLineNumbers w:val="0"/>
+        <w:ind w:left="720"/>
+        <w:rPr>
+          <w:rFonts w:hint="default" w:ascii="Times New Roman" w:hAnsi="Times New Roman" w:cs="Times New Roman"/>
+        </w:rPr>
+      </w:pPr>
+      <w:r>
+        <w:rPr>
+          <w:rFonts w:hint="default" w:ascii="Times New Roman" w:hAnsi="Times New Roman" w:cs="Times New Roman"/>
+          <w:b/>
+          <w:bCs/>
+        </w:rPr>
+        <w:t>Modern JavaScript:</w:t>
+      </w:r>
+      <w:r>
+        <w:rPr>
+          <w:rFonts w:hint="default" w:ascii="Times New Roman" w:hAnsi="Times New Roman" w:cs="Times New Roman"/>
+        </w:rPr>
+        <w:t xml:space="preserve"> Mengganti metode pemanggilan fungsi dengan </w:t>
+      </w:r>
+      <w:r>
+        <w:rPr>
+          <w:rStyle w:val="8"/>
+          <w:rFonts w:hint="default" w:ascii="Times New Roman" w:hAnsi="Times New Roman" w:cs="Times New Roman"/>
+        </w:rPr>
+        <w:t>addEventListener</w:t>
+      </w:r>
+      <w:r>
+        <w:rPr>
+          <w:rFonts w:hint="default" w:ascii="Times New Roman" w:hAnsi="Times New Roman" w:cs="Times New Roman"/>
+        </w:rPr>
+        <w:t>. Logika JavaScript kini bertugas secara mandiri di belakang layar untuk "mendengarkan" interaksi klik pada elemen yang memiliki ID tertentu.</w:t>
       </w:r>
     </w:p>
     <w:p>
@@ -3621,63 +4050,6 @@
         <w:jc w:val="left"/>
         <w:rPr>
           <w:rFonts w:hint="default" w:ascii="Times New Roman" w:hAnsi="Times New Roman" w:cs="Times New Roman"/>
-        </w:rPr>
-      </w:pPr>
-    </w:p>
-    <w:p>
-      <w:pPr>
-        <w:pStyle w:val="10"/>
-        <w:keepNext w:val="0"/>
-        <w:keepLines w:val="0"/>
-        <w:widowControl/>
-        <w:numPr>
-          <w:ilvl w:val="0"/>
-          <w:numId w:val="0"/>
-        </w:numPr>
-        <w:suppressLineNumbers w:val="0"/>
-        <w:spacing w:before="0" w:beforeAutospacing="1" w:after="0" w:afterAutospacing="1"/>
-        <w:ind w:right="0" w:rightChars="0"/>
-        <w:jc w:val="left"/>
-        <w:rPr>
-          <w:rFonts w:hint="default" w:ascii="Times New Roman" w:hAnsi="Times New Roman" w:cs="Times New Roman"/>
-        </w:rPr>
-      </w:pPr>
-    </w:p>
-    <w:p>
-      <w:pPr>
-        <w:pStyle w:val="10"/>
-        <w:keepNext w:val="0"/>
-        <w:keepLines w:val="0"/>
-        <w:widowControl/>
-        <w:numPr>
-          <w:ilvl w:val="0"/>
-          <w:numId w:val="0"/>
-        </w:numPr>
-        <w:suppressLineNumbers w:val="0"/>
-        <w:spacing w:before="0" w:beforeAutospacing="1" w:after="0" w:afterAutospacing="1"/>
-        <w:ind w:right="0" w:rightChars="0"/>
-        <w:jc w:val="left"/>
-        <w:rPr>
-          <w:rFonts w:hint="default" w:ascii="Times New Roman" w:hAnsi="Times New Roman" w:cs="Times New Roman"/>
-        </w:rPr>
-      </w:pPr>
-    </w:p>
-    <w:p>
-      <w:pPr>
-        <w:pStyle w:val="10"/>
-        <w:keepNext w:val="0"/>
-        <w:keepLines w:val="0"/>
-        <w:widowControl/>
-        <w:numPr>
-          <w:ilvl w:val="0"/>
-          <w:numId w:val="0"/>
-        </w:numPr>
-        <w:suppressLineNumbers w:val="0"/>
-        <w:spacing w:before="0" w:beforeAutospacing="1" w:after="0" w:afterAutospacing="1"/>
-        <w:ind w:right="0" w:rightChars="0"/>
-        <w:jc w:val="left"/>
-        <w:rPr>
-          <w:rFonts w:hint="default" w:ascii="Times New Roman" w:hAnsi="Times New Roman" w:cs="Times New Roman"/>
           <w:b/>
           <w:bCs/>
           <w:lang w:val="en-US"/>
@@ -4688,25 +5060,36 @@
         <w:keepLines w:val="0"/>
         <w:widowControl/>
         <w:suppressLineNumbers w:val="0"/>
-      </w:pPr>
-      <w:r>
-        <w:rPr>
+        <w:rPr>
+          <w:rFonts w:hint="default" w:ascii="Times New Roman" w:hAnsi="Times New Roman" w:cs="Times New Roman"/>
+        </w:rPr>
+      </w:pPr>
+      <w:r>
+        <w:rPr>
+          <w:rFonts w:hint="default" w:ascii="Times New Roman" w:hAnsi="Times New Roman" w:cs="Times New Roman"/>
           <w:b/>
           <w:bCs/>
         </w:rPr>
         <w:t>Bagian 3: Git, Keamanan, &amp; Deployment (Sesi Pasca-Talkshow)</w:t>
       </w:r>
       <w:r>
+        <w:rPr>
+          <w:rFonts w:hint="default" w:ascii="Times New Roman" w:hAnsi="Times New Roman" w:cs="Times New Roman"/>
+        </w:rPr>
         <w:t xml:space="preserve"> Ini adalah kumpulan "rintangan terakhir" yang biasanya membuat </w:t>
       </w:r>
       <w:r>
         <w:rPr>
+          <w:rFonts w:hint="default" w:ascii="Times New Roman" w:hAnsi="Times New Roman" w:cs="Times New Roman"/>
           <w:i/>
           <w:iCs/>
         </w:rPr>
         <w:t>developer</w:t>
       </w:r>
       <w:r>
+        <w:rPr>
+          <w:rFonts w:hint="default" w:ascii="Times New Roman" w:hAnsi="Times New Roman" w:cs="Times New Roman"/>
+        </w:rPr>
         <w:t xml:space="preserve"> pemula menyerah, tapi berhasil kamu taklukkan:</w:t>
       </w:r>
     </w:p>
@@ -4717,9 +5100,13 @@
         <w:keepLines w:val="0"/>
         <w:widowControl/>
         <w:suppressLineNumbers w:val="0"/>
-      </w:pPr>
-      <w:r>
-        <w:rPr>
+        <w:rPr>
+          <w:rFonts w:hint="default" w:ascii="Times New Roman" w:hAnsi="Times New Roman" w:cs="Times New Roman"/>
+        </w:rPr>
+      </w:pPr>
+      <w:r>
+        <w:rPr>
+          <w:rFonts w:hint="default" w:ascii="Times New Roman" w:hAnsi="Times New Roman" w:cs="Times New Roman"/>
           <w:b/>
           <w:bCs/>
         </w:rPr>
@@ -4734,34 +5121,49 @@
         <w:widowControl/>
         <w:suppressLineNumbers w:val="0"/>
         <w:ind w:left="720"/>
-      </w:pPr>
-      <w:r>
-        <w:rPr>
+        <w:rPr>
+          <w:rFonts w:hint="default" w:ascii="Times New Roman" w:hAnsi="Times New Roman" w:cs="Times New Roman"/>
+        </w:rPr>
+      </w:pPr>
+      <w:r>
+        <w:rPr>
+          <w:rFonts w:hint="default" w:ascii="Times New Roman" w:hAnsi="Times New Roman" w:cs="Times New Roman"/>
           <w:b/>
           <w:bCs/>
         </w:rPr>
         <w:t>Masalah:</w:t>
       </w:r>
       <w:r>
+        <w:rPr>
+          <w:rFonts w:hint="default" w:ascii="Times New Roman" w:hAnsi="Times New Roman" w:cs="Times New Roman"/>
+        </w:rPr>
         <w:t xml:space="preserve"> Tombol </w:t>
       </w:r>
       <w:r>
         <w:rPr>
+          <w:rFonts w:hint="default" w:ascii="Times New Roman" w:hAnsi="Times New Roman" w:cs="Times New Roman"/>
           <w:i/>
           <w:iCs/>
         </w:rPr>
         <w:t>hamburger</w:t>
       </w:r>
       <w:r>
+        <w:rPr>
+          <w:rFonts w:hint="default" w:ascii="Times New Roman" w:hAnsi="Times New Roman" w:cs="Times New Roman"/>
+        </w:rPr>
         <w:t xml:space="preserve"> (☰) membesar memenuhi layar atau diam di tengah karena mengikuti aturan global </w:t>
       </w:r>
       <w:r>
         <w:rPr>
           <w:rStyle w:val="8"/>
+          <w:rFonts w:hint="default" w:ascii="Times New Roman" w:hAnsi="Times New Roman" w:cs="Times New Roman"/>
         </w:rPr>
         <w:t>button { width: 100%; }</w:t>
       </w:r>
       <w:r>
+        <w:rPr>
+          <w:rFonts w:hint="default" w:ascii="Times New Roman" w:hAnsi="Times New Roman" w:cs="Times New Roman"/>
+        </w:rPr>
         <w:t>.</w:t>
       </w:r>
     </w:p>
@@ -4777,6 +5179,9 @@
         <w:suppressLineNumbers w:val="0"/>
         <w:spacing w:before="0" w:beforeAutospacing="1" w:after="0" w:afterAutospacing="1"/>
         <w:ind w:left="1440" w:hanging="360"/>
+        <w:rPr>
+          <w:rFonts w:hint="default" w:ascii="Times New Roman" w:hAnsi="Times New Roman" w:cs="Times New Roman"/>
+        </w:rPr>
       </w:pPr>
     </w:p>
     <w:p>
@@ -4787,43 +5192,62 @@
         <w:widowControl/>
         <w:suppressLineNumbers w:val="0"/>
         <w:ind w:left="720"/>
-      </w:pPr>
-      <w:r>
-        <w:rPr>
+        <w:rPr>
+          <w:rFonts w:hint="default" w:ascii="Times New Roman" w:hAnsi="Times New Roman" w:cs="Times New Roman"/>
+        </w:rPr>
+      </w:pPr>
+      <w:r>
+        <w:rPr>
+          <w:rFonts w:hint="default" w:ascii="Times New Roman" w:hAnsi="Times New Roman" w:cs="Times New Roman"/>
           <w:b/>
           <w:bCs/>
         </w:rPr>
         <w:t>Pelajaran:</w:t>
       </w:r>
       <w:r>
+        <w:rPr>
+          <w:rFonts w:hint="default" w:ascii="Times New Roman" w:hAnsi="Times New Roman" w:cs="Times New Roman"/>
+        </w:rPr>
         <w:t xml:space="preserve"> Aturan CSS yang bersifat umum (seperti tag </w:t>
       </w:r>
       <w:r>
         <w:rPr>
           <w:rStyle w:val="8"/>
+          <w:rFonts w:hint="default" w:ascii="Times New Roman" w:hAnsi="Times New Roman" w:cs="Times New Roman"/>
         </w:rPr>
         <w:t>button</w:t>
       </w:r>
       <w:r>
+        <w:rPr>
+          <w:rFonts w:hint="default" w:ascii="Times New Roman" w:hAnsi="Times New Roman" w:cs="Times New Roman"/>
+        </w:rPr>
         <w:t xml:space="preserve">) akan menurun ke semua elemen sejenis. Gunakan </w:t>
       </w:r>
       <w:r>
         <w:rPr>
           <w:rStyle w:val="8"/>
+          <w:rFonts w:hint="default" w:ascii="Times New Roman" w:hAnsi="Times New Roman" w:cs="Times New Roman"/>
         </w:rPr>
         <w:t>width: auto !important;</w:t>
       </w:r>
       <w:r>
+        <w:rPr>
+          <w:rFonts w:hint="default" w:ascii="Times New Roman" w:hAnsi="Times New Roman" w:cs="Times New Roman"/>
+        </w:rPr>
         <w:t xml:space="preserve"> atau </w:t>
       </w:r>
       <w:r>
         <w:rPr>
+          <w:rFonts w:hint="default" w:ascii="Times New Roman" w:hAnsi="Times New Roman" w:cs="Times New Roman"/>
           <w:i/>
           <w:iCs/>
         </w:rPr>
         <w:t>class</w:t>
       </w:r>
       <w:r>
+        <w:rPr>
+          <w:rFonts w:hint="default" w:ascii="Times New Roman" w:hAnsi="Times New Roman" w:cs="Times New Roman"/>
+        </w:rPr>
         <w:t xml:space="preserve"> yang lebih spesifik untuk memberikan "penawar" pada elemen yang ingin dikecualikan.</w:t>
       </w:r>
     </w:p>
@@ -4834,9 +5258,13 @@
         <w:keepLines w:val="0"/>
         <w:widowControl/>
         <w:suppressLineNumbers w:val="0"/>
-      </w:pPr>
-      <w:r>
-        <w:rPr>
+        <w:rPr>
+          <w:rFonts w:hint="default" w:ascii="Times New Roman" w:hAnsi="Times New Roman" w:cs="Times New Roman"/>
+        </w:rPr>
+      </w:pPr>
+      <w:r>
+        <w:rPr>
+          <w:rFonts w:hint="default" w:ascii="Times New Roman" w:hAnsi="Times New Roman" w:cs="Times New Roman"/>
           <w:b/>
           <w:bCs/>
         </w:rPr>
@@ -4852,53 +5280,69 @@
         <w:suppressLineNumbers w:val="0"/>
         <w:ind w:left="720"/>
         <w:rPr>
-          <w:rFonts w:hint="default"/>
+          <w:rFonts w:hint="default" w:ascii="Times New Roman" w:hAnsi="Times New Roman" w:cs="Times New Roman"/>
           <w:lang w:val="en-US"/>
         </w:rPr>
       </w:pPr>
       <w:r>
         <w:rPr>
+          <w:rFonts w:hint="default" w:ascii="Times New Roman" w:hAnsi="Times New Roman" w:cs="Times New Roman"/>
           <w:b/>
           <w:bCs/>
         </w:rPr>
         <w:t>Masalah:</w:t>
       </w:r>
       <w:r>
+        <w:rPr>
+          <w:rFonts w:hint="default" w:ascii="Times New Roman" w:hAnsi="Times New Roman" w:cs="Times New Roman"/>
+        </w:rPr>
         <w:t xml:space="preserve"> </w:t>
       </w:r>
       <w:r>
         <w:rPr>
+          <w:rFonts w:hint="default" w:ascii="Times New Roman" w:hAnsi="Times New Roman" w:cs="Times New Roman"/>
           <w:i/>
           <w:iCs/>
         </w:rPr>
         <w:t>Error</w:t>
       </w:r>
       <w:r>
+        <w:rPr>
+          <w:rFonts w:hint="default" w:ascii="Times New Roman" w:hAnsi="Times New Roman" w:cs="Times New Roman"/>
+        </w:rPr>
         <w:t xml:space="preserve"> autentikasi saat melakukan </w:t>
       </w:r>
       <w:r>
         <w:rPr>
+          <w:rFonts w:hint="default" w:ascii="Times New Roman" w:hAnsi="Times New Roman" w:cs="Times New Roman"/>
           <w:i/>
           <w:iCs/>
         </w:rPr>
         <w:t>push</w:t>
       </w:r>
       <w:r>
+        <w:rPr>
+          <w:rFonts w:hint="default" w:ascii="Times New Roman" w:hAnsi="Times New Roman" w:cs="Times New Roman"/>
+        </w:rPr>
         <w:t xml:space="preserve"> karena GitHub menolak </w:t>
       </w:r>
       <w:r>
         <w:rPr>
+          <w:rFonts w:hint="default" w:ascii="Times New Roman" w:hAnsi="Times New Roman" w:cs="Times New Roman"/>
           <w:i/>
           <w:iCs/>
         </w:rPr>
         <w:t>password</w:t>
       </w:r>
       <w:r>
+        <w:rPr>
+          <w:rFonts w:hint="default" w:ascii="Times New Roman" w:hAnsi="Times New Roman" w:cs="Times New Roman"/>
+        </w:rPr>
         <w:t xml:space="preserve"> akun biasa di terminal</w:t>
       </w:r>
       <w:r>
         <w:rPr>
-          <w:rFonts w:hint="default"/>
+          <w:rFonts w:hint="default" w:ascii="Times New Roman" w:hAnsi="Times New Roman" w:cs="Times New Roman"/>
           <w:lang w:val="en-US"/>
         </w:rPr>
         <w:t>.</w:t>
@@ -4912,25 +5356,36 @@
         <w:widowControl/>
         <w:suppressLineNumbers w:val="0"/>
         <w:ind w:left="720"/>
-      </w:pPr>
-      <w:r>
-        <w:rPr>
+        <w:rPr>
+          <w:rFonts w:hint="default" w:ascii="Times New Roman" w:hAnsi="Times New Roman" w:cs="Times New Roman"/>
+        </w:rPr>
+      </w:pPr>
+      <w:r>
+        <w:rPr>
+          <w:rFonts w:hint="default" w:ascii="Times New Roman" w:hAnsi="Times New Roman" w:cs="Times New Roman"/>
           <w:b/>
           <w:bCs/>
         </w:rPr>
         <w:t>Pelajaran:</w:t>
       </w:r>
       <w:r>
+        <w:rPr>
+          <w:rFonts w:hint="default" w:ascii="Times New Roman" w:hAnsi="Times New Roman" w:cs="Times New Roman"/>
+        </w:rPr>
         <w:t xml:space="preserve"> Sejak 2021, GitHub mewajibkan penggunaan </w:t>
       </w:r>
       <w:r>
         <w:rPr>
+          <w:rFonts w:hint="default" w:ascii="Times New Roman" w:hAnsi="Times New Roman" w:cs="Times New Roman"/>
           <w:i/>
           <w:iCs/>
         </w:rPr>
         <w:t>Personal Access Token</w:t>
       </w:r>
       <w:r>
+        <w:rPr>
+          <w:rFonts w:hint="default" w:ascii="Times New Roman" w:hAnsi="Times New Roman" w:cs="Times New Roman"/>
+        </w:rPr>
         <w:t xml:space="preserve"> (PAT). Simpan token ini seperti kunci brankas, karena ia adalah identitas digitalmu di terminal.</w:t>
       </w:r>
     </w:p>
@@ -4941,9 +5396,13 @@
         <w:keepLines w:val="0"/>
         <w:widowControl/>
         <w:suppressLineNumbers w:val="0"/>
-      </w:pPr>
-      <w:r>
-        <w:rPr>
+        <w:rPr>
+          <w:rFonts w:hint="default" w:ascii="Times New Roman" w:hAnsi="Times New Roman" w:cs="Times New Roman"/>
+        </w:rPr>
+      </w:pPr>
+      <w:r>
+        <w:rPr>
+          <w:rFonts w:hint="default" w:ascii="Times New Roman" w:hAnsi="Times New Roman" w:cs="Times New Roman"/>
           <w:b/>
           <w:bCs/>
         </w:rPr>
@@ -4958,33 +5417,48 @@
         <w:widowControl/>
         <w:suppressLineNumbers w:val="0"/>
         <w:ind w:left="720"/>
-      </w:pPr>
-      <w:r>
-        <w:rPr>
+        <w:rPr>
+          <w:rFonts w:hint="default" w:ascii="Times New Roman" w:hAnsi="Times New Roman" w:cs="Times New Roman"/>
+        </w:rPr>
+      </w:pPr>
+      <w:r>
+        <w:rPr>
+          <w:rFonts w:hint="default" w:ascii="Times New Roman" w:hAnsi="Times New Roman" w:cs="Times New Roman"/>
           <w:b/>
           <w:bCs/>
         </w:rPr>
         <w:t>Masalah:</w:t>
       </w:r>
       <w:r>
+        <w:rPr>
+          <w:rFonts w:hint="default" w:ascii="Times New Roman" w:hAnsi="Times New Roman" w:cs="Times New Roman"/>
+        </w:rPr>
         <w:t xml:space="preserve"> Terminal Kitty menolak perintah </w:t>
       </w:r>
       <w:r>
         <w:rPr>
           <w:rStyle w:val="8"/>
+          <w:rFonts w:hint="default" w:ascii="Times New Roman" w:hAnsi="Times New Roman" w:cs="Times New Roman"/>
         </w:rPr>
         <w:t>git add</w:t>
       </w:r>
       <w:r>
+        <w:rPr>
+          <w:rFonts w:hint="default" w:ascii="Times New Roman" w:hAnsi="Times New Roman" w:cs="Times New Roman"/>
+        </w:rPr>
         <w:t xml:space="preserve"> atau </w:t>
       </w:r>
       <w:r>
         <w:rPr>
           <w:rStyle w:val="8"/>
+          <w:rFonts w:hint="default" w:ascii="Times New Roman" w:hAnsi="Times New Roman" w:cs="Times New Roman"/>
         </w:rPr>
         <w:t>git commit</w:t>
       </w:r>
       <w:r>
+        <w:rPr>
+          <w:rFonts w:hint="default" w:ascii="Times New Roman" w:hAnsi="Times New Roman" w:cs="Times New Roman"/>
+        </w:rPr>
         <w:t>.</w:t>
       </w:r>
     </w:p>
@@ -4996,24 +5470,35 @@
         <w:widowControl/>
         <w:suppressLineNumbers w:val="0"/>
         <w:ind w:left="720"/>
-      </w:pPr>
-      <w:r>
-        <w:rPr>
+        <w:rPr>
+          <w:rFonts w:hint="default" w:ascii="Times New Roman" w:hAnsi="Times New Roman" w:cs="Times New Roman"/>
+        </w:rPr>
+      </w:pPr>
+      <w:r>
+        <w:rPr>
+          <w:rFonts w:hint="default" w:ascii="Times New Roman" w:hAnsi="Times New Roman" w:cs="Times New Roman"/>
           <w:b/>
           <w:bCs/>
         </w:rPr>
         <w:t>Pelajaran:</w:t>
       </w:r>
       <w:r>
+        <w:rPr>
+          <w:rFonts w:hint="default" w:ascii="Times New Roman" w:hAnsi="Times New Roman" w:cs="Times New Roman"/>
+        </w:rPr>
         <w:t xml:space="preserve"> Folder proyek baru tidak otomatis menjadi folder Git. Gunakan perintah </w:t>
       </w:r>
       <w:r>
         <w:rPr>
           <w:rStyle w:val="8"/>
+          <w:rFonts w:hint="default" w:ascii="Times New Roman" w:hAnsi="Times New Roman" w:cs="Times New Roman"/>
         </w:rPr>
         <w:t>git init</w:t>
       </w:r>
       <w:r>
+        <w:rPr>
+          <w:rFonts w:hint="default" w:ascii="Times New Roman" w:hAnsi="Times New Roman" w:cs="Times New Roman"/>
+        </w:rPr>
         <w:t xml:space="preserve"> untuk "membaptis" folder tersebut agar bisa menggunakan fitur pelacakan kode.</w:t>
       </w:r>
     </w:p>
@@ -5024,9 +5509,13 @@
         <w:keepLines w:val="0"/>
         <w:widowControl/>
         <w:suppressLineNumbers w:val="0"/>
-      </w:pPr>
-      <w:r>
-        <w:rPr>
+        <w:rPr>
+          <w:rFonts w:hint="default" w:ascii="Times New Roman" w:hAnsi="Times New Roman" w:cs="Times New Roman"/>
+        </w:rPr>
+      </w:pPr>
+      <w:r>
+        <w:rPr>
+          <w:rFonts w:hint="default" w:ascii="Times New Roman" w:hAnsi="Times New Roman" w:cs="Times New Roman"/>
           <w:b/>
           <w:bCs/>
         </w:rPr>
@@ -5041,25 +5530,36 @@
         <w:widowControl/>
         <w:suppressLineNumbers w:val="0"/>
         <w:ind w:left="720"/>
-      </w:pPr>
-      <w:r>
-        <w:rPr>
+        <w:rPr>
+          <w:rFonts w:hint="default" w:ascii="Times New Roman" w:hAnsi="Times New Roman" w:cs="Times New Roman"/>
+        </w:rPr>
+      </w:pPr>
+      <w:r>
+        <w:rPr>
+          <w:rFonts w:hint="default" w:ascii="Times New Roman" w:hAnsi="Times New Roman" w:cs="Times New Roman"/>
           <w:b/>
           <w:bCs/>
         </w:rPr>
         <w:t>Masalah:</w:t>
       </w:r>
       <w:r>
+        <w:rPr>
+          <w:rFonts w:hint="default" w:ascii="Times New Roman" w:hAnsi="Times New Roman" w:cs="Times New Roman"/>
+        </w:rPr>
         <w:t xml:space="preserve"> Sudah capek-capek mengedit kode di VS Code, tapi </w:t>
       </w:r>
       <w:r>
         <w:rPr>
+          <w:rFonts w:hint="default" w:ascii="Times New Roman" w:hAnsi="Times New Roman" w:cs="Times New Roman"/>
           <w:i/>
           <w:iCs/>
         </w:rPr>
         <w:t>website</w:t>
       </w:r>
       <w:r>
+        <w:rPr>
+          <w:rFonts w:hint="default" w:ascii="Times New Roman" w:hAnsi="Times New Roman" w:cs="Times New Roman"/>
+        </w:rPr>
         <w:t xml:space="preserve"> di internet (GitHub Pages) tidak kunjung berubah.</w:t>
       </w:r>
     </w:p>
@@ -5077,46 +5577,299 @@
       </w:pPr>
       <w:r>
         <w:rPr>
+          <w:rFonts w:hint="default" w:ascii="Times New Roman" w:hAnsi="Times New Roman" w:cs="Times New Roman"/>
           <w:b/>
           <w:bCs/>
         </w:rPr>
         <w:t>Pelajaran:</w:t>
       </w:r>
       <w:r>
+        <w:rPr>
+          <w:rFonts w:hint="default" w:ascii="Times New Roman" w:hAnsi="Times New Roman" w:cs="Times New Roman"/>
+        </w:rPr>
         <w:t xml:space="preserve"> Perubahan di laptop tidak akan terbang secara ajaib ke internet. Ingat siklus "Tiga Mantra": </w:t>
       </w:r>
       <w:r>
         <w:rPr>
+          <w:rFonts w:hint="default" w:ascii="Times New Roman" w:hAnsi="Times New Roman" w:cs="Times New Roman"/>
           <w:i/>
           <w:iCs/>
         </w:rPr>
         <w:t>Add</w:t>
       </w:r>
       <w:r>
+        <w:rPr>
+          <w:rFonts w:hint="default" w:ascii="Times New Roman" w:hAnsi="Times New Roman" w:cs="Times New Roman"/>
+        </w:rPr>
         <w:t xml:space="preserve"> (tandai), </w:t>
       </w:r>
       <w:r>
         <w:rPr>
+          <w:rFonts w:hint="default" w:ascii="Times New Roman" w:hAnsi="Times New Roman" w:cs="Times New Roman"/>
           <w:i/>
           <w:iCs/>
         </w:rPr>
         <w:t>Commit</w:t>
       </w:r>
       <w:r>
+        <w:rPr>
+          <w:rFonts w:hint="default" w:ascii="Times New Roman" w:hAnsi="Times New Roman" w:cs="Times New Roman"/>
+        </w:rPr>
         <w:t xml:space="preserve"> (simpan catatan), dan </w:t>
       </w:r>
       <w:r>
         <w:rPr>
+          <w:rFonts w:hint="default" w:ascii="Times New Roman" w:hAnsi="Times New Roman" w:cs="Times New Roman"/>
           <w:i/>
           <w:iCs/>
         </w:rPr>
         <w:t>Push/Sync</w:t>
       </w:r>
       <w:r>
+        <w:rPr>
+          <w:rFonts w:hint="default" w:ascii="Times New Roman" w:hAnsi="Times New Roman" w:cs="Times New Roman"/>
+        </w:rPr>
         <w:t xml:space="preserve"> (terbangkan ke server).</w:t>
       </w:r>
+    </w:p>
+    <w:p>
+      <w:pPr>
+        <w:pStyle w:val="4"/>
+        <w:keepNext w:val="0"/>
+        <w:keepLines w:val="0"/>
+        <w:widowControl/>
+        <w:suppressLineNumbers w:val="0"/>
+        <w:rPr>
+          <w:rFonts w:hint="default" w:ascii="Times New Roman" w:hAnsi="Times New Roman" w:cs="Times New Roman"/>
+        </w:rPr>
+      </w:pPr>
       <w:bookmarkStart w:id="0" w:name="_GoBack"/>
       <w:bookmarkEnd w:id="0"/>
+      <w:r>
+        <w:rPr>
+          <w:rFonts w:hint="default" w:ascii="Times New Roman" w:hAnsi="Times New Roman" w:cs="Times New Roman"/>
+        </w:rPr>
+        <w:t>CATATAN EVALUASI (Sesi Lanjutan)</w:t>
+      </w:r>
+    </w:p>
+    <w:p>
+      <w:pPr>
+        <w:pStyle w:val="10"/>
+        <w:keepNext w:val="0"/>
+        <w:keepLines w:val="0"/>
+        <w:widowControl/>
+        <w:suppressLineNumbers w:val="0"/>
+        <w:ind w:left="720"/>
+        <w:rPr>
+          <w:rFonts w:hint="default" w:ascii="Times New Roman" w:hAnsi="Times New Roman" w:cs="Times New Roman"/>
+        </w:rPr>
+      </w:pPr>
+      <w:r>
+        <w:rPr>
+          <w:rFonts w:hint="default" w:ascii="Times New Roman" w:hAnsi="Times New Roman" w:cs="Times New Roman"/>
+          <w:b/>
+          <w:bCs/>
+        </w:rPr>
+        <w:t>Ketelitian Tingkat Tinggi (Pixel Perfect):</w:t>
+      </w:r>
+      <w:r>
+        <w:rPr>
+          <w:rFonts w:hint="default" w:ascii="Times New Roman" w:hAnsi="Times New Roman" w:cs="Times New Roman"/>
+        </w:rPr>
+        <w:t xml:space="preserve"> Mampu mendeteksi anomali visual yang sangat kecil, seperti perbedaan ketebalan huruf (</w:t>
+      </w:r>
+      <w:r>
+        <w:rPr>
+          <w:rFonts w:hint="default" w:ascii="Times New Roman" w:hAnsi="Times New Roman" w:cs="Times New Roman"/>
+          <w:i/>
+          <w:iCs/>
+        </w:rPr>
+        <w:t>font-weight</w:t>
+      </w:r>
+      <w:r>
+        <w:rPr>
+          <w:rFonts w:hint="default" w:ascii="Times New Roman" w:hAnsi="Times New Roman" w:cs="Times New Roman"/>
+        </w:rPr>
+        <w:t>) pada tombol yang berbeda tag (</w:t>
+      </w:r>
+      <w:r>
+        <w:rPr>
+          <w:rStyle w:val="8"/>
+          <w:rFonts w:hint="default" w:ascii="Times New Roman" w:hAnsi="Times New Roman" w:cs="Times New Roman"/>
+        </w:rPr>
+        <w:t>&lt;a&gt;</w:t>
+      </w:r>
+      <w:r>
+        <w:rPr>
+          <w:rFonts w:hint="default" w:ascii="Times New Roman" w:hAnsi="Times New Roman" w:cs="Times New Roman"/>
+        </w:rPr>
+        <w:t xml:space="preserve"> vs </w:t>
+      </w:r>
+      <w:r>
+        <w:rPr>
+          <w:rStyle w:val="8"/>
+          <w:rFonts w:hint="default" w:ascii="Times New Roman" w:hAnsi="Times New Roman" w:cs="Times New Roman"/>
+        </w:rPr>
+        <w:t>&lt;button&gt;</w:t>
+      </w:r>
+      <w:r>
+        <w:rPr>
+          <w:rFonts w:hint="default" w:ascii="Times New Roman" w:hAnsi="Times New Roman" w:cs="Times New Roman"/>
+        </w:rPr>
+        <w:t xml:space="preserve">). Ini adalah insting krusial bagi seorang </w:t>
+      </w:r>
+      <w:r>
+        <w:rPr>
+          <w:rFonts w:hint="default" w:ascii="Times New Roman" w:hAnsi="Times New Roman" w:cs="Times New Roman"/>
+          <w:i/>
+          <w:iCs/>
+        </w:rPr>
+        <w:t>Front-End Developer</w:t>
+      </w:r>
+      <w:r>
+        <w:rPr>
+          <w:rFonts w:hint="default" w:ascii="Times New Roman" w:hAnsi="Times New Roman" w:cs="Times New Roman"/>
+        </w:rPr>
+        <w:t>.</w:t>
+      </w:r>
+    </w:p>
+    <w:p>
+      <w:pPr>
+        <w:pStyle w:val="10"/>
+        <w:keepNext w:val="0"/>
+        <w:keepLines w:val="0"/>
+        <w:widowControl/>
+        <w:suppressLineNumbers w:val="0"/>
+        <w:ind w:left="720"/>
+        <w:rPr>
+          <w:rFonts w:hint="default" w:ascii="Times New Roman" w:hAnsi="Times New Roman" w:cs="Times New Roman"/>
+        </w:rPr>
+      </w:pPr>
+      <w:r>
+        <w:rPr>
+          <w:rFonts w:hint="default" w:ascii="Times New Roman" w:hAnsi="Times New Roman" w:cs="Times New Roman"/>
+          <w:b/>
+          <w:bCs/>
+        </w:rPr>
+        <w:t>Endurance &amp; Adaptasi:</w:t>
+      </w:r>
+      <w:r>
+        <w:rPr>
+          <w:rFonts w:hint="default" w:ascii="Times New Roman" w:hAnsi="Times New Roman" w:cs="Times New Roman"/>
+        </w:rPr>
+        <w:t xml:space="preserve"> Memiliki ketahanan belajar yang sangat baik ("gaspol") meskipun materi bergeser dengan cepat dari manipulasi tata letak visual (CSS) ke logika sistem (JavaScript).</w:t>
+      </w:r>
+    </w:p>
+    <w:p>
+      <w:pPr>
+        <w:pStyle w:val="10"/>
+        <w:keepNext w:val="0"/>
+        <w:keepLines w:val="0"/>
+        <w:widowControl/>
+        <w:suppressLineNumbers w:val="0"/>
+        <w:ind w:left="720"/>
+        <w:rPr>
+          <w:rFonts w:hint="default" w:ascii="Times New Roman" w:hAnsi="Times New Roman" w:cs="Times New Roman"/>
+        </w:rPr>
+      </w:pPr>
+      <w:r>
+        <w:rPr>
+          <w:rFonts w:hint="default" w:ascii="Times New Roman" w:hAnsi="Times New Roman" w:cs="Times New Roman"/>
+          <w:b/>
+          <w:bCs/>
+        </w:rPr>
+        <w:t>Konsistensi Clean Code:</w:t>
+      </w:r>
+      <w:r>
+        <w:rPr>
+          <w:rFonts w:hint="default" w:ascii="Times New Roman" w:hAnsi="Times New Roman" w:cs="Times New Roman"/>
+        </w:rPr>
+        <w:t xml:space="preserve"> Mulai biasakan diri untuk tidak lagi tergoda menuliskan perintah langsung di dalam HTML (seperti CSS </w:t>
+      </w:r>
+      <w:r>
+        <w:rPr>
+          <w:rFonts w:hint="default" w:ascii="Times New Roman" w:hAnsi="Times New Roman" w:cs="Times New Roman"/>
+          <w:i/>
+          <w:iCs/>
+        </w:rPr>
+        <w:t>inline</w:t>
+      </w:r>
+      <w:r>
+        <w:rPr>
+          <w:rFonts w:hint="default" w:ascii="Times New Roman" w:hAnsi="Times New Roman" w:cs="Times New Roman"/>
+        </w:rPr>
+        <w:t xml:space="preserve"> </w:t>
+      </w:r>
+      <w:r>
+        <w:rPr>
+          <w:rStyle w:val="8"/>
+          <w:rFonts w:hint="default" w:ascii="Times New Roman" w:hAnsi="Times New Roman" w:cs="Times New Roman"/>
+        </w:rPr>
+        <w:t>style="..."</w:t>
+      </w:r>
+      <w:r>
+        <w:rPr>
+          <w:rFonts w:hint="default" w:ascii="Times New Roman" w:hAnsi="Times New Roman" w:cs="Times New Roman"/>
+        </w:rPr>
+        <w:t xml:space="preserve"> atau JS </w:t>
+      </w:r>
+      <w:r>
+        <w:rPr>
+          <w:rStyle w:val="8"/>
+          <w:rFonts w:hint="default" w:ascii="Times New Roman" w:hAnsi="Times New Roman" w:cs="Times New Roman"/>
+        </w:rPr>
+        <w:t>onclick="..."</w:t>
+      </w:r>
+      <w:r>
+        <w:rPr>
+          <w:rFonts w:hint="default" w:ascii="Times New Roman" w:hAnsi="Times New Roman" w:cs="Times New Roman"/>
+        </w:rPr>
+        <w:t xml:space="preserve">). Biarkan HTML tetap bersih sebagai murni kerangka tulang </w:t>
+      </w:r>
+      <w:r>
+        <w:rPr>
+          <w:rFonts w:hint="default" w:ascii="Times New Roman" w:hAnsi="Times New Roman" w:cs="Times New Roman"/>
+          <w:i/>
+          <w:iCs/>
+        </w:rPr>
+        <w:t>website</w:t>
+      </w:r>
+      <w:r>
+        <w:rPr>
+          <w:rFonts w:hint="default" w:ascii="Times New Roman" w:hAnsi="Times New Roman" w:cs="Times New Roman"/>
+        </w:rPr>
+        <w:t>.</w:t>
+      </w:r>
+    </w:p>
+    <w:p>
+      <w:pPr>
+        <w:keepNext w:val="0"/>
+        <w:keepLines w:val="0"/>
+        <w:widowControl/>
+        <w:numPr>
+          <w:ilvl w:val="0"/>
+          <w:numId w:val="3"/>
+        </w:numPr>
+        <w:suppressLineNumbers w:val="0"/>
+        <w:spacing w:before="0" w:beforeAutospacing="1" w:after="0" w:afterAutospacing="1"/>
+        <w:ind w:left="1440" w:hanging="360"/>
+        <w:rPr>
+          <w:rFonts w:hint="default" w:ascii="Times New Roman" w:hAnsi="Times New Roman" w:cs="Times New Roman"/>
+        </w:rPr>
+      </w:pPr>
+    </w:p>
+    <w:p>
+      <w:pPr>
+        <w:pStyle w:val="10"/>
+        <w:keepNext w:val="0"/>
+        <w:keepLines w:val="0"/>
+        <w:widowControl/>
+        <w:suppressLineNumbers w:val="0"/>
+        <w:ind w:left="720"/>
+        <w:rPr>
+          <w:rFonts w:hint="default" w:ascii="Times New Roman" w:hAnsi="Times New Roman" w:cs="Times New Roman"/>
+        </w:rPr>
+      </w:pPr>
     </w:p>
     <w:sectPr>
       <w:pgSz w:w="11906" w:h="16838"/>
@@ -5299,11 +6052,163 @@
       </w:rPr>
     </w:lvl>
   </w:abstractNum>
+  <w:abstractNum w:abstractNumId="2">
+    <w:nsid w:val="6BCA46D4"/>
+    <w:multiLevelType w:val="multilevel"/>
+    <w:tmpl w:val="6BCA46D4"/>
+    <w:lvl w:ilvl="0" w:tentative="0">
+      <w:start w:val="1"/>
+      <w:numFmt w:val="bullet"/>
+      <w:lvlText w:val=""/>
+      <w:lvlJc w:val="left"/>
+      <w:pPr>
+        <w:tabs>
+          <w:tab w:val="left" w:pos="720"/>
+        </w:tabs>
+        <w:ind w:left="720" w:hanging="360"/>
+      </w:pPr>
+      <w:rPr>
+        <w:rFonts w:hint="default" w:ascii="Symbol" w:hAnsi="Symbol" w:cs="Symbol"/>
+        <w:sz w:val="20"/>
+      </w:rPr>
+    </w:lvl>
+    <w:lvl w:ilvl="1" w:tentative="0">
+      <w:start w:val="1"/>
+      <w:numFmt w:val="bullet"/>
+      <w:lvlText w:val="o"/>
+      <w:lvlJc w:val="left"/>
+      <w:pPr>
+        <w:tabs>
+          <w:tab w:val="left" w:pos="1440"/>
+        </w:tabs>
+        <w:ind w:left="1440" w:hanging="360"/>
+      </w:pPr>
+      <w:rPr>
+        <w:rFonts w:hint="default" w:ascii="Courier New" w:hAnsi="Courier New" w:cs="Courier New"/>
+        <w:sz w:val="20"/>
+      </w:rPr>
+    </w:lvl>
+    <w:lvl w:ilvl="2" w:tentative="0">
+      <w:start w:val="1"/>
+      <w:numFmt w:val="bullet"/>
+      <w:lvlText w:val=""/>
+      <w:lvlJc w:val="left"/>
+      <w:pPr>
+        <w:tabs>
+          <w:tab w:val="left" w:pos="2160"/>
+        </w:tabs>
+        <w:ind w:left="2160" w:hanging="360"/>
+      </w:pPr>
+      <w:rPr>
+        <w:rFonts w:hint="default" w:ascii="Wingdings" w:hAnsi="Wingdings" w:cs="Wingdings"/>
+        <w:sz w:val="20"/>
+      </w:rPr>
+    </w:lvl>
+    <w:lvl w:ilvl="3" w:tentative="0">
+      <w:start w:val="1"/>
+      <w:numFmt w:val="bullet"/>
+      <w:lvlText w:val=""/>
+      <w:lvlJc w:val="left"/>
+      <w:pPr>
+        <w:tabs>
+          <w:tab w:val="left" w:pos="2880"/>
+        </w:tabs>
+        <w:ind w:left="2880" w:hanging="360"/>
+      </w:pPr>
+      <w:rPr>
+        <w:rFonts w:hint="default" w:ascii="Wingdings" w:hAnsi="Wingdings" w:cs="Wingdings"/>
+        <w:sz w:val="20"/>
+      </w:rPr>
+    </w:lvl>
+    <w:lvl w:ilvl="4" w:tentative="0">
+      <w:start w:val="1"/>
+      <w:numFmt w:val="bullet"/>
+      <w:lvlText w:val=""/>
+      <w:lvlJc w:val="left"/>
+      <w:pPr>
+        <w:tabs>
+          <w:tab w:val="left" w:pos="3600"/>
+        </w:tabs>
+        <w:ind w:left="3600" w:hanging="360"/>
+      </w:pPr>
+      <w:rPr>
+        <w:rFonts w:hint="default" w:ascii="Wingdings" w:hAnsi="Wingdings" w:cs="Wingdings"/>
+        <w:sz w:val="20"/>
+      </w:rPr>
+    </w:lvl>
+    <w:lvl w:ilvl="5" w:tentative="0">
+      <w:start w:val="1"/>
+      <w:numFmt w:val="bullet"/>
+      <w:lvlText w:val=""/>
+      <w:lvlJc w:val="left"/>
+      <w:pPr>
+        <w:tabs>
+          <w:tab w:val="left" w:pos="4320"/>
+        </w:tabs>
+        <w:ind w:left="4320" w:hanging="360"/>
+      </w:pPr>
+      <w:rPr>
+        <w:rFonts w:hint="default" w:ascii="Wingdings" w:hAnsi="Wingdings" w:cs="Wingdings"/>
+        <w:sz w:val="20"/>
+      </w:rPr>
+    </w:lvl>
+    <w:lvl w:ilvl="6" w:tentative="0">
+      <w:start w:val="1"/>
+      <w:numFmt w:val="bullet"/>
+      <w:lvlText w:val=""/>
+      <w:lvlJc w:val="left"/>
+      <w:pPr>
+        <w:tabs>
+          <w:tab w:val="left" w:pos="5040"/>
+        </w:tabs>
+        <w:ind w:left="5040" w:hanging="360"/>
+      </w:pPr>
+      <w:rPr>
+        <w:rFonts w:hint="default" w:ascii="Wingdings" w:hAnsi="Wingdings" w:cs="Wingdings"/>
+        <w:sz w:val="20"/>
+      </w:rPr>
+    </w:lvl>
+    <w:lvl w:ilvl="7" w:tentative="0">
+      <w:start w:val="1"/>
+      <w:numFmt w:val="bullet"/>
+      <w:lvlText w:val=""/>
+      <w:lvlJc w:val="left"/>
+      <w:pPr>
+        <w:tabs>
+          <w:tab w:val="left" w:pos="5760"/>
+        </w:tabs>
+        <w:ind w:left="5760" w:hanging="360"/>
+      </w:pPr>
+      <w:rPr>
+        <w:rFonts w:hint="default" w:ascii="Wingdings" w:hAnsi="Wingdings" w:cs="Wingdings"/>
+        <w:sz w:val="20"/>
+      </w:rPr>
+    </w:lvl>
+    <w:lvl w:ilvl="8" w:tentative="0">
+      <w:start w:val="1"/>
+      <w:numFmt w:val="bullet"/>
+      <w:lvlText w:val=""/>
+      <w:lvlJc w:val="left"/>
+      <w:pPr>
+        <w:tabs>
+          <w:tab w:val="left" w:pos="6480"/>
+        </w:tabs>
+        <w:ind w:left="6480" w:hanging="360"/>
+      </w:pPr>
+      <w:rPr>
+        <w:rFonts w:hint="default" w:ascii="Wingdings" w:hAnsi="Wingdings" w:cs="Wingdings"/>
+        <w:sz w:val="20"/>
+      </w:rPr>
+    </w:lvl>
+  </w:abstractNum>
   <w:num w:numId="1">
     <w:abstractNumId w:val="0"/>
   </w:num>
   <w:num w:numId="2">
     <w:abstractNumId w:val="1"/>
+  </w:num>
+  <w:num w:numId="3">
+    <w:abstractNumId w:val="2"/>
   </w:num>
 </w:numbering>
 </file>

</xml_diff>